<commit_message>
Week 2 Hands on Exercise 4
</commit_message>
<xml_diff>
--- a/Week 2 Hands on Exercise 3.docx
+++ b/Week 2 Hands on Exercise 3.docx
@@ -10,13 +10,8 @@
     <w:p/>
     <w:p>
       <w:r>
-        <w:t>for (let number = 1; number &lt;= 20; number+</w:t>
-      </w:r>
-      <w:proofErr w:type="gramStart"/>
-      <w:r>
-        <w:t>+) {</w:t>
-      </w:r>
-      <w:proofErr w:type="gramEnd"/>
+        <w:t>for (let number = 1; number &lt;= 20; number++) {</w:t>
+      </w:r>
     </w:p>
     <w:p/>
     <w:p>
@@ -26,23 +21,7 @@
     </w:p>
     <w:p>
       <w:r>
-        <w:t xml:space="preserve">        </w:t>
-      </w:r>
-      <w:proofErr w:type="gramStart"/>
-      <w:r>
-        <w:t>console.log(</w:t>
-      </w:r>
-      <w:proofErr w:type="gramEnd"/>
-      <w:r>
-        <w:t xml:space="preserve">number + " </w:t>
-      </w:r>
-      <w:proofErr w:type="spellStart"/>
-      <w:r>
-        <w:t>FizzBuzz</w:t>
-      </w:r>
-      <w:proofErr w:type="spellEnd"/>
-      <w:r>
-        <w:t>");</w:t>
+        <w:t>        console.log(number + " FizzBuzz");</w:t>
       </w:r>
     </w:p>
     <w:p>
@@ -52,25 +31,12 @@
     </w:p>
     <w:p>
       <w:r>
-        <w:t xml:space="preserve">    else if (number % 3 === </w:t>
-      </w:r>
-      <w:proofErr w:type="gramStart"/>
-      <w:r>
-        <w:t>0) {</w:t>
-      </w:r>
-      <w:proofErr w:type="gramEnd"/>
-    </w:p>
-    <w:p>
-      <w:r>
-        <w:t xml:space="preserve">        </w:t>
-      </w:r>
-      <w:proofErr w:type="gramStart"/>
-      <w:r>
-        <w:t>console.log(</w:t>
-      </w:r>
-      <w:proofErr w:type="gramEnd"/>
-      <w:r>
-        <w:t>number + " Fizz");</w:t>
+        <w:t>    else if (number % 3 === 0) {</w:t>
+      </w:r>
+    </w:p>
+    <w:p>
+      <w:r>
+        <w:t>        console.log(number + " Fizz");</w:t>
       </w:r>
     </w:p>
     <w:p>
@@ -80,25 +46,12 @@
     </w:p>
     <w:p>
       <w:r>
-        <w:t xml:space="preserve">    else if (number % 5 === </w:t>
-      </w:r>
-      <w:proofErr w:type="gramStart"/>
-      <w:r>
-        <w:t>0) {</w:t>
-      </w:r>
-      <w:proofErr w:type="gramEnd"/>
-    </w:p>
-    <w:p>
-      <w:r>
-        <w:t xml:space="preserve">        </w:t>
-      </w:r>
-      <w:proofErr w:type="gramStart"/>
-      <w:r>
-        <w:t>console.log(</w:t>
-      </w:r>
-      <w:proofErr w:type="gramEnd"/>
-      <w:r>
-        <w:t>number + " Buzz");</w:t>
+        <w:t>    else if (number % 5 === 0) {</w:t>
+      </w:r>
+    </w:p>
+    <w:p>
+      <w:r>
+        <w:t>        console.log(number + " Buzz");</w:t>
       </w:r>
     </w:p>
     <w:p>
@@ -127,7 +80,62 @@
         <w:t>}</w:t>
       </w:r>
     </w:p>
-    <w:p/>
+    <w:p>
+      <w:r>
+        <w:rPr>
+          <w:noProof/>
+        </w:rPr>
+        <w:lastRenderedPageBreak/>
+        <w:drawing>
+          <wp:inline distT="0" distB="0" distL="0" distR="0" wp14:anchorId="27B12300" wp14:editId="4387439C">
+            <wp:extent cx="5727700" cy="6912610"/>
+            <wp:effectExtent l="0" t="0" r="6350" b="2540"/>
+            <wp:docPr id="1996696452" name="Picture 1"/>
+            <wp:cNvGraphicFramePr>
+              <a:graphicFrameLocks xmlns:a="http://schemas.openxmlformats.org/drawingml/2006/main" noChangeAspect="1"/>
+            </wp:cNvGraphicFramePr>
+            <a:graphic xmlns:a="http://schemas.openxmlformats.org/drawingml/2006/main">
+              <a:graphicData uri="http://schemas.openxmlformats.org/drawingml/2006/picture">
+                <pic:pic xmlns:pic="http://schemas.openxmlformats.org/drawingml/2006/picture">
+                  <pic:nvPicPr>
+                    <pic:cNvPr id="0" name="Picture 1"/>
+                    <pic:cNvPicPr>
+                      <a:picLocks noChangeAspect="1" noChangeArrowheads="1"/>
+                    </pic:cNvPicPr>
+                  </pic:nvPicPr>
+                  <pic:blipFill>
+                    <a:blip r:embed="rId4">
+                      <a:extLst>
+                        <a:ext uri="{28A0092B-C50C-407E-A947-70E740481C1C}">
+                          <a14:useLocalDpi xmlns:a14="http://schemas.microsoft.com/office/drawing/2010/main" val="0"/>
+                        </a:ext>
+                      </a:extLst>
+                    </a:blip>
+                    <a:srcRect/>
+                    <a:stretch>
+                      <a:fillRect/>
+                    </a:stretch>
+                  </pic:blipFill>
+                  <pic:spPr bwMode="auto">
+                    <a:xfrm>
+                      <a:off x="0" y="0"/>
+                      <a:ext cx="5727700" cy="6912610"/>
+                    </a:xfrm>
+                    <a:prstGeom prst="rect">
+                      <a:avLst/>
+                    </a:prstGeom>
+                    <a:noFill/>
+                    <a:ln>
+                      <a:noFill/>
+                    </a:ln>
+                  </pic:spPr>
+                </pic:pic>
+              </a:graphicData>
+            </a:graphic>
+          </wp:inline>
+        </w:drawing>
+      </w:r>
+    </w:p>
     <w:sectPr>
       <w:pgSz w:w="12240" w:h="15840"/>
       <w:pgMar w:top="1440" w:right="1440" w:bottom="1440" w:left="1440" w:header="720" w:footer="720" w:gutter="0"/>

</xml_diff>